<commit_message>
Section 8: course title and a separate upload file
- Section 8 heading is now "8. Relevant Technical Background", the title of
  the ECE 414 assignment (also in the TOC of the full proposal)
- tools/build_proposal.py also writes
  docs/ECE_414_Section8_Relevant_Technical_Background.docx (+ PDF, 15 pages):
  cover page, Section 8 with Fig. 11 and Tables 17-23, and only the
  references it cites ([1], [2], [18]-[21], [39]); a note under the heading
  says that numbers follow the full proposal

Co-Authored-By: Claude Opus 5.5 <noreply@anthropic.com>
Claude-Session: https://claude.ai/code/session_01ETEkBEZ8ArkyGszih1TjZ8
</commit_message>
<xml_diff>
--- a/docs/ECE_414_Proposal_Draft_with_Section8.docx
+++ b/docs/ECE_414_Proposal_Draft_with_Section8.docx
@@ -1688,7 +1688,7 @@
             <w:rStyle w:val="Hyperlink"/>
             <w:noProof/>
           </w:rPr>
-          <w:t>8. Literature Review: Articles and Patents</w:t>
+          <w:t>8. Relevant Technical Background</w:t>
         </w:r>
         <w:r>
           <w:rPr>
@@ -20901,7 +20901,7 @@
       </w:pPr>
       <w:bookmarkStart w:id="39" w:name="_Toc700039"/>
       <w:r>
-        <w:t>8. Literature Review: Articles and Patents</w:t>
+        <w:t>8. Relevant Technical Background</w:t>
       </w:r>
       <w:bookmarkEnd w:id="39"/>
     </w:p>

</xml_diff>